<commit_message>
Add depth (number-of-layers) ablation — subtask 6 now interactive
- model.build_cnn(filters=...) makes depth configurable; train_from_df threads it.
- experiments.py: new "depth" study (2/3/4 conv blocks, both channels),
  subprocess-isolated + checkpointed; resumes (the 16 prior runs were reused).
- Result: depth barely matters — current ~0.69-0.71, vibration 1.00 at all depths;
  fewer blocks = MORE params (less pooling). 3 blocks chosen as the sweet spot.
- Dashboard: new "Depth (#layers)" ablation tab + updated CNN depth note +
  Requirements Coverage now marks the layer-count study as interactive.
- Dashboard forced CPU-only (CUDA_VISIBLE_DEVICES=-1) so it never contends with a
  GPU training job (fixes the "Dst tensor is not initialized" load crash).
- docs/experiments.md §4, report §9.4 (EN + AR) + depth_ablation.png; report
  PDFs/DOCX rebuilt (EN 30pp, AR 24pp). 38 tests pass.

Co-Authored-By: Claude Opus 4.8 (1M context) <noreply@anthropic.com>
</commit_message>
<xml_diff>
--- a/docs/build/report-ar.docx
+++ b/docs/build/report-ar.docx
@@ -28,7 +28,7 @@
         </w:p>
       </w:sdtContent>
     </w:sdt>
-    <w:bookmarkStart w:id="72" w:name="X80e316569022d425b4fa8f3b5d258ea836d1e6e"/>
+    <w:bookmarkStart w:id="76" w:name="X80e316569022d425b4fa8f3b5d258ea836d1e6e"/>
     <w:p>
       <w:pPr>
         <w:pStyle w:val="Heading1"/>
@@ -4560,7 +4560,7 @@
     </w:p>
     <w:bookmarkEnd w:id="51"/>
     <w:bookmarkEnd w:id="52"/>
-    <w:bookmarkStart w:id="60" w:name="تجارب-التحسين"/>
+    <w:bookmarkStart w:id="64" w:name="تجارب-التحسين"/>
     <w:p>
       <w:pPr>
         <w:pStyle w:val="Heading2"/>
@@ -5517,13 +5517,316 @@
       </w:r>
     </w:p>
     <w:bookmarkEnd w:id="58"/>
-    <w:bookmarkStart w:id="59" w:name="ضوابط-فرط-التخصيص"/>
+    <w:bookmarkStart w:id="62" w:name="أثر-عمق-الشبكة-عدد-الطبقات"/>
     <w:p>
       <w:pPr>
         <w:pStyle w:val="Heading3"/>
       </w:pPr>
       <w:r>
-        <w:t xml:space="preserve">9.4 ضوابط فرط التخصيص</w:t>
+        <w:t xml:space="preserve">9.4 أثر عمق الشبكة (عدد الطبقات)</w:t>
+      </w:r>
+    </w:p>
+    <w:tbl>
+      <w:tblPr>
+        <w:tblStyle w:val="Table"/>
+        <w:tblW w:type="auto" w:w="0"/>
+        <w:tblLook w:firstRow="1" w:lastRow="0" w:firstColumn="0" w:lastColumn="0" w:noHBand="0" w:noVBand="0" w:val="0020"/>
+      </w:tblPr>
+      <w:tblGrid>
+        <w:gridCol w:w="1980"/>
+        <w:gridCol w:w="1980"/>
+        <w:gridCol w:w="1980"/>
+        <w:gridCol w:w="1980"/>
+      </w:tblGrid>
+      <w:tr>
+        <w:trPr>
+          <w:tblHeader w:val="on"/>
+        </w:trPr>
+        <w:tc>
+          <w:tcPr/>
+          <w:p>
+            <w:pPr>
+              <w:pStyle w:val="Compact"/>
+            </w:pPr>
+            <w:r>
+              <w:t xml:space="preserve">القناة</w:t>
+            </w:r>
+          </w:p>
+        </w:tc>
+        <w:tc>
+          <w:tcPr/>
+          <w:p>
+            <w:pPr>
+              <w:pStyle w:val="Compact"/>
+            </w:pPr>
+            <w:r>
+              <w:t xml:space="preserve">كتلتان</w:t>
+            </w:r>
+          </w:p>
+        </w:tc>
+        <w:tc>
+          <w:tcPr/>
+          <w:p>
+            <w:pPr>
+              <w:pStyle w:val="Compact"/>
+            </w:pPr>
+            <w:r>
+              <w:t xml:space="preserve">3 كتل</w:t>
+            </w:r>
+          </w:p>
+        </w:tc>
+        <w:tc>
+          <w:tcPr/>
+          <w:p>
+            <w:pPr>
+              <w:pStyle w:val="Compact"/>
+            </w:pPr>
+            <w:r>
+              <w:t xml:space="preserve">4 كتل</w:t>
+            </w:r>
+          </w:p>
+        </w:tc>
+      </w:tr>
+      <w:tr>
+        <w:tc>
+          <w:tcPr/>
+          <w:p>
+            <w:pPr>
+              <w:pStyle w:val="Compact"/>
+            </w:pPr>
+            <w:r>
+              <w:t xml:space="preserve">current (الدقة المتوازنة)</w:t>
+            </w:r>
+          </w:p>
+        </w:tc>
+        <w:tc>
+          <w:tcPr/>
+          <w:p>
+            <w:pPr>
+              <w:pStyle w:val="Compact"/>
+            </w:pPr>
+            <w:r>
+              <w:t xml:space="preserve">0.71</w:t>
+            </w:r>
+          </w:p>
+        </w:tc>
+        <w:tc>
+          <w:tcPr/>
+          <w:p>
+            <w:pPr>
+              <w:pStyle w:val="Compact"/>
+            </w:pPr>
+            <w:r>
+              <w:t xml:space="preserve">0.70</w:t>
+            </w:r>
+          </w:p>
+        </w:tc>
+        <w:tc>
+          <w:tcPr/>
+          <w:p>
+            <w:pPr>
+              <w:pStyle w:val="Compact"/>
+            </w:pPr>
+            <w:r>
+              <w:t xml:space="preserve">0.69</w:t>
+            </w:r>
+          </w:p>
+        </w:tc>
+      </w:tr>
+      <w:tr>
+        <w:tc>
+          <w:tcPr/>
+          <w:p>
+            <w:pPr>
+              <w:pStyle w:val="Compact"/>
+            </w:pPr>
+            <w:r>
+              <w:t xml:space="preserve">vibration (الدقة المتوازنة)</w:t>
+            </w:r>
+          </w:p>
+        </w:tc>
+        <w:tc>
+          <w:tcPr/>
+          <w:p>
+            <w:pPr>
+              <w:pStyle w:val="Compact"/>
+            </w:pPr>
+            <w:r>
+              <w:t xml:space="preserve">1.00</w:t>
+            </w:r>
+          </w:p>
+        </w:tc>
+        <w:tc>
+          <w:tcPr/>
+          <w:p>
+            <w:pPr>
+              <w:pStyle w:val="Compact"/>
+            </w:pPr>
+            <w:r>
+              <w:t xml:space="preserve">1.00</w:t>
+            </w:r>
+          </w:p>
+        </w:tc>
+        <w:tc>
+          <w:tcPr/>
+          <w:p>
+            <w:pPr>
+              <w:pStyle w:val="Compact"/>
+            </w:pPr>
+            <w:r>
+              <w:t xml:space="preserve">1.00</w:t>
+            </w:r>
+          </w:p>
+        </w:tc>
+      </w:tr>
+    </w:tbl>
+    <w:p>
+      <w:pPr>
+        <w:pStyle w:val="CaptionedFigure"/>
+      </w:pPr>
+      <w:r>
+        <w:drawing>
+          <wp:inline>
+            <wp:extent cx="5334000" cy="3556000"/>
+            <wp:effectExtent b="0" l="0" r="0" t="0"/>
+            <wp:docPr descr="حذف العمق" title="" id="60" name="Picture"/>
+            <a:graphic>
+              <a:graphicData uri="http://schemas.openxmlformats.org/drawingml/2006/picture">
+                <pic:pic>
+                  <pic:nvPicPr>
+                    <pic:cNvPr descr="../../results/depth_ablation.png" id="61" name="Picture"/>
+                    <pic:cNvPicPr>
+                      <a:picLocks noChangeArrowheads="1" noChangeAspect="1"/>
+                    </pic:cNvPicPr>
+                  </pic:nvPicPr>
+                  <pic:blipFill>
+                    <a:blip r:embed="rId59"/>
+                    <a:stretch>
+                      <a:fillRect/>
+                    </a:stretch>
+                  </pic:blipFill>
+                  <pic:spPr bwMode="auto">
+                    <a:xfrm>
+                      <a:off x="0" y="0"/>
+                      <a:ext cx="5334000" cy="3556000"/>
+                    </a:xfrm>
+                    <a:prstGeom prst="rect">
+                      <a:avLst/>
+                    </a:prstGeom>
+                    <a:noFill/>
+                    <a:ln w="9525">
+                      <a:noFill/>
+                      <a:headEnd/>
+                      <a:tailEnd/>
+                    </a:ln>
+                  </pic:spPr>
+                </pic:pic>
+              </a:graphicData>
+            </a:graphic>
+          </wp:inline>
+        </w:drawing>
+      </w:r>
+    </w:p>
+    <w:p>
+      <w:pPr>
+        <w:pStyle w:val="ImageCaption"/>
+      </w:pPr>
+      <w:r>
+        <w:t xml:space="preserve">حذف العمق</w:t>
+      </w:r>
+    </w:p>
+    <w:p>
+      <w:pPr>
+        <w:pStyle w:val="BodyText"/>
+      </w:pPr>
+      <w:r>
+        <w:rPr>
+          <w:i/>
+          <w:iCs/>
+        </w:rPr>
+        <w:t xml:space="preserve">الشكل 9.2 — أثر عدد الكتل الالتفافية.</w:t>
+      </w:r>
+      <w:r>
+        <w:t xml:space="preserve"> </w:t>
+      </w:r>
+      <w:r>
+        <w:t xml:space="preserve">العمق لا يكاد يغيّر النتيجة: يبقى التيار ~0.69–0.71</w:t>
+      </w:r>
+      <w:r>
+        <w:t xml:space="preserve"> </w:t>
+      </w:r>
+      <w:r>
+        <w:t xml:space="preserve">(قيده جودة الإشارة لا السَّعة)، والاهتزاز مثالي عند كل عمق. ولاحظ أن</w:t>
+      </w:r>
+      <w:r>
+        <w:t xml:space="preserve"> </w:t>
+      </w:r>
+      <w:r>
+        <w:rPr>
+          <w:i/>
+          <w:iCs/>
+        </w:rPr>
+        <w:t xml:space="preserve">تقليل</w:t>
+      </w:r>
+      <w:r>
+        <w:t xml:space="preserve"> </w:t>
+      </w:r>
+      <w:r>
+        <w:t xml:space="preserve">الكتل يعني</w:t>
+      </w:r>
+      <w:r>
+        <w:t xml:space="preserve"> </w:t>
+      </w:r>
+      <w:r>
+        <w:rPr>
+          <w:i/>
+          <w:iCs/>
+        </w:rPr>
+        <w:t xml:space="preserve">زيادة</w:t>
+      </w:r>
+      <w:r>
+        <w:t xml:space="preserve"> </w:t>
+      </w:r>
+      <w:r>
+        <w:t xml:space="preserve">المعاملات (تجميع أقل ← خريطة مسطّحة أكبر): كتلتان ≈ 23.9M، 3 كتل ≈ 11.2M، 4 كتل</w:t>
+      </w:r>
+      <w:r>
+        <w:t xml:space="preserve"> </w:t>
+      </w:r>
+      <w:r>
+        <w:t xml:space="preserve">≈ 5.1M. ومن ثَمّ</w:t>
+      </w:r>
+      <w:r>
+        <w:t xml:space="preserve"> </w:t>
+      </w:r>
+      <w:r>
+        <w:rPr>
+          <w:b/>
+          <w:bCs/>
+        </w:rPr>
+        <w:t xml:space="preserve">3 كتل</w:t>
+      </w:r>
+      <w:r>
+        <w:t xml:space="preserve"> </w:t>
+      </w:r>
+      <w:r>
+        <w:t xml:space="preserve">هي الخيار الافتراضي — دقة قرب الأفضل بعدد معاملات معتدل وخطر</w:t>
+      </w:r>
+      <w:r>
+        <w:t xml:space="preserve"> </w:t>
+      </w:r>
+      <w:r>
+        <w:t xml:space="preserve">فرط تخصيص أقل من شبكة أعمق.</w:t>
+      </w:r>
+    </w:p>
+    <w:bookmarkEnd w:id="62"/>
+    <w:bookmarkStart w:id="63" w:name="ضوابط-فرط-التخصيص"/>
+    <w:p>
+      <w:pPr>
+        <w:pStyle w:val="Heading3"/>
+      </w:pPr>
+      <w:r>
+        <w:t xml:space="preserve">9.5 ضوابط فرط التخصيص</w:t>
       </w:r>
     </w:p>
     <w:p>
@@ -5541,9 +5844,9 @@
         </w:pict>
       </w:r>
     </w:p>
-    <w:bookmarkEnd w:id="59"/>
-    <w:bookmarkEnd w:id="60"/>
-    <w:bookmarkStart w:id="64" w:name="الاستنتاجات-والعمل-المستقبلي"/>
+    <w:bookmarkEnd w:id="63"/>
+    <w:bookmarkEnd w:id="64"/>
+    <w:bookmarkStart w:id="68" w:name="الاستنتاجات-والعمل-المستقبلي"/>
     <w:p>
       <w:pPr>
         <w:pStyle w:val="Heading2"/>
@@ -5552,7 +5855,7 @@
         <w:t xml:space="preserve">10. الاستنتاجات والعمل المستقبلي</w:t>
       </w:r>
     </w:p>
-    <w:bookmarkStart w:id="61" w:name="الاستنتاجات"/>
+    <w:bookmarkStart w:id="65" w:name="الاستنتاجات"/>
     <w:p>
       <w:pPr>
         <w:pStyle w:val="Heading3"/>
@@ -5654,8 +5957,8 @@
         <w:t xml:space="preserve">العمل مدعوم بـ 38 اختبار وحدة وتكامل مستمر، ومتاح علناً ليتمكّن باحثون آخرون من إعادة إنتاجه وتوسيعه.</w:t>
       </w:r>
     </w:p>
-    <w:bookmarkEnd w:id="61"/>
-    <w:bookmarkStart w:id="62" w:name="القيود"/>
+    <w:bookmarkEnd w:id="65"/>
+    <w:bookmarkStart w:id="66" w:name="القيود"/>
     <w:p>
       <w:pPr>
         <w:pStyle w:val="Heading3"/>
@@ -5672,8 +5975,8 @@
         <w:t xml:space="preserve">القيد الرئيسي هو العدد الصغير من التسجيلات السليمة المستقلة، الذي يقيّد مدى قوة ادعاء التعميم. وإزالة المغنطة والحِمل الزائد حاضران اصطناعياً فقط. ومقارنة الاندماج إرشادية لا مضبوطة بدقة.</w:t>
       </w:r>
     </w:p>
-    <w:bookmarkEnd w:id="62"/>
-    <w:bookmarkStart w:id="63" w:name="العمل-المستقبلي"/>
+    <w:bookmarkEnd w:id="66"/>
+    <w:bookmarkStart w:id="67" w:name="العمل-المستقبلي"/>
     <w:p>
       <w:pPr>
         <w:pStyle w:val="Heading3"/>
@@ -5799,9 +6102,9 @@
         </w:pict>
       </w:r>
     </w:p>
-    <w:bookmarkEnd w:id="63"/>
-    <w:bookmarkEnd w:id="64"/>
-    <w:bookmarkStart w:id="65" w:name="المراجع"/>
+    <w:bookmarkEnd w:id="67"/>
+    <w:bookmarkEnd w:id="68"/>
+    <w:bookmarkStart w:id="69" w:name="المراجع"/>
     <w:p>
       <w:pPr>
         <w:pStyle w:val="Heading2"/>
@@ -6180,8 +6483,8 @@
         </w:pict>
       </w:r>
     </w:p>
-    <w:bookmarkEnd w:id="65"/>
-    <w:bookmarkStart w:id="66" w:name="الملحق-a-إعادة-إنتاج-النتائج"/>
+    <w:bookmarkEnd w:id="69"/>
+    <w:bookmarkStart w:id="70" w:name="الملحق-a-إعادة-إنتاج-النتائج"/>
     <w:p>
       <w:pPr>
         <w:pStyle w:val="Heading2"/>
@@ -6492,8 +6795,8 @@
         <w:t xml:space="preserve"> demo</w:t>
       </w:r>
     </w:p>
-    <w:bookmarkEnd w:id="66"/>
-    <w:bookmarkStart w:id="67" w:name="الملحق-b-الضبط-الأساسي-config.yaml"/>
+    <w:bookmarkEnd w:id="70"/>
+    <w:bookmarkStart w:id="71" w:name="الملحق-b-الضبط-الأساسي-config.yaml"/>
     <w:p>
       <w:pPr>
         <w:pStyle w:val="Heading2"/>
@@ -6980,8 +7283,8 @@
         </w:tc>
       </w:tr>
     </w:tbl>
-    <w:bookmarkEnd w:id="67"/>
-    <w:bookmarkStart w:id="68" w:name="الملحق-c-تخطيط-المستودع"/>
+    <w:bookmarkEnd w:id="71"/>
+    <w:bookmarkStart w:id="72" w:name="الملحق-c-تخطيط-المستودع"/>
     <w:p>
       <w:pPr>
         <w:pStyle w:val="Heading2"/>
@@ -7073,8 +7376,8 @@
         <w:t xml:space="preserve">config.yaml    all parameters · Makefile  targets · CITATION.cff</w:t>
       </w:r>
     </w:p>
-    <w:bookmarkEnd w:id="68"/>
-    <w:bookmarkStart w:id="69" w:name="الملحق-d-مخطط-المانيفست-datamanifest.csv"/>
+    <w:bookmarkEnd w:id="72"/>
+    <w:bookmarkStart w:id="73" w:name="الملحق-d-مخطط-المانيفست-datamanifest.csv"/>
     <w:p>
       <w:pPr>
         <w:pStyle w:val="Heading2"/>
@@ -7109,8 +7412,8 @@
         <w:t xml:space="preserve">— صفّ واحد لكل مقطع؛ وهو المصدر الوحيد للحقيقة الذي يربط كل نافذة إشارة بمخططها الطيفي وتسميتها وتقسيمها.</w:t>
       </w:r>
     </w:p>
-    <w:bookmarkEnd w:id="69"/>
-    <w:bookmarkStart w:id="70" w:name="الملحق-e-جرد-الاختبارات-38-اختبارا"/>
+    <w:bookmarkEnd w:id="73"/>
+    <w:bookmarkStart w:id="74" w:name="الملحق-e-جرد-الاختبارات-38-اختبارا"/>
     <w:p>
       <w:pPr>
         <w:pStyle w:val="Heading2"/>
@@ -7127,8 +7430,8 @@
         <w:t xml:space="preserve">التحقق من الضبط؛ عمليات CRUD على المانيفست؛ التقسيم الخالي من التسرّب (بما في ذلك ضمانات الفئات الصغيرة)؛ التقطيع؛ تحليل أسماء ملفات KAIST؛ موازنة الفئات؛ ترجيح الفئات؛ شكل المخطط الطيفي؛ المولّد الاصطناعي؛ فهرسة محمّل البيانات؛ بناء النموذج المرجعي ونموذج الاندماج؛ إقران الاندماج (لا حالة تمتدّ عبر التقسيمات)؛ اختبار دخان (smoke test) للتدريب؛ مقاييس التقييم (بما في ذلك مجموعة جزئية من الفئات). وتتخطّى الاختبارات المعتمدة على TensorFlow تخطّياً نظيفاً عند غياب TF.</w:t>
       </w:r>
     </w:p>
-    <w:bookmarkEnd w:id="70"/>
-    <w:bookmarkStart w:id="71" w:name="الملحق-f-تدقيق-مجموعات-البيانات"/>
+    <w:bookmarkEnd w:id="74"/>
+    <w:bookmarkStart w:id="75" w:name="الملحق-f-تدقيق-مجموعات-البيانات"/>
     <w:p>
       <w:pPr>
         <w:pStyle w:val="Heading2"/>
@@ -7474,8 +7777,8 @@
         <w:t xml:space="preserve">ملاحظة حول الطول/الصيغة: حُرِّر هذا التقرير بصيغة Markdown؛ وعند تنضيده إلى A4/Letter (Word أو LaTeX) مع الأشكال والجداول وتباعد أسطر 1.15–1.5 يمتدّ على 25–35 صفحة المطلوبة.</w:t>
       </w:r>
     </w:p>
-    <w:bookmarkEnd w:id="71"/>
-    <w:bookmarkEnd w:id="72"/>
+    <w:bookmarkEnd w:id="75"/>
+    <w:bookmarkEnd w:id="76"/>
     <w:sectPr>
       <w:footnotePr>
         <w:numRestart w:val="eachSect"/>

</xml_diff>

<commit_message>
Generated-data study: richer synthetic, SpecAugment, synth->real transfer (honest negative)
Implements the three requested generated-data strategies and benchmarks them on the
real held-out current channel (python/transfer_experiment.py):
- simulate.py: build_signal gains f0/fr/load/noise knobs -> diverse "virtual motors".
- data_loader.py: spec_augment (time/freq masking + noise); make_dataset aug_mode;
  train_from_df threads aug_mode.
- Result: baseline 0.70; SpecAugment 0.71 (negligible); synthetic pre-train -> real
  fine-tune 0.35 (HURT - domain gap, healthy recall -> 0). Honest conclusion:
  generated data can't substitute for real-recording diversity (contrast ImageNet
  transfer 0.89). Documented in experiments.md 6, report 9.6 (EN+AR) + transfer_
  experiment.png, and a dashboard Results "Generated data" tab. `make transfer`.

Co-Authored-By: Claude Opus 4.8 (1M context) <noreply@anthropic.com>
</commit_message>
<xml_diff>
--- a/docs/build/report-ar.docx
+++ b/docs/build/report-ar.docx
@@ -28,7 +28,7 @@
         </w:p>
       </w:sdtContent>
     </w:sdt>
-    <w:bookmarkStart w:id="80" w:name="X80e316569022d425b4fa8f3b5d258ea836d1e6e"/>
+    <w:bookmarkStart w:id="84" w:name="X80e316569022d425b4fa8f3b5d258ea836d1e6e"/>
     <w:p>
       <w:pPr>
         <w:pStyle w:val="Heading1"/>
@@ -4560,7 +4560,7 @@
     </w:p>
     <w:bookmarkEnd w:id="51"/>
     <w:bookmarkEnd w:id="52"/>
-    <w:bookmarkStart w:id="68" w:name="تجارب-التحسين"/>
+    <w:bookmarkStart w:id="72" w:name="تجارب-التحسين"/>
     <w:p>
       <w:pPr>
         <w:pStyle w:val="Heading2"/>
@@ -6183,13 +6183,438 @@
       </w:r>
     </w:p>
     <w:bookmarkEnd w:id="66"/>
-    <w:bookmarkStart w:id="67" w:name="ضوابط-فرط-التخصيص"/>
+    <w:bookmarkStart w:id="70" w:name="X9234e025a97214a1e59fbd9b5e48acddf1f276c"/>
     <w:p>
       <w:pPr>
         <w:pStyle w:val="Heading3"/>
       </w:pPr>
       <w:r>
-        <w:t xml:space="preserve">9.6 ضوابط فرط التخصيص</w:t>
+        <w:t xml:space="preserve">9.6 هل تساعد البيانات المُولّدة؟ (التدريب المسبق الاصطناعي والتعزيز)</w:t>
+      </w:r>
+    </w:p>
+    <w:p>
+      <w:pPr>
+        <w:pStyle w:val="FirstParagraph"/>
+      </w:pPr>
+      <w:r>
+        <w:t xml:space="preserve">اختبرنا ما إذا كان</w:t>
+      </w:r>
+      <w:r>
+        <w:t xml:space="preserve"> </w:t>
+      </w:r>
+      <w:r>
+        <w:rPr>
+          <w:i/>
+          <w:iCs/>
+        </w:rPr>
+        <w:t xml:space="preserve">توليد</w:t>
+      </w:r>
+      <w:r>
+        <w:t xml:space="preserve"> </w:t>
+      </w:r>
+      <w:r>
+        <w:t xml:space="preserve">البيانات يرفع قناة التيّار الضعيفة، على مجموعة اختبار التيّار</w:t>
+      </w:r>
+      <w:r>
+        <w:t xml:space="preserve"> </w:t>
+      </w:r>
+      <w:r>
+        <w:t xml:space="preserve">الحقيقية المحجوزة:</w:t>
+      </w:r>
+    </w:p>
+    <w:tbl>
+      <w:tblPr>
+        <w:tblStyle w:val="Table"/>
+        <w:tblW w:type="auto" w:w="0"/>
+        <w:tblLook w:firstRow="1" w:lastRow="0" w:firstColumn="0" w:lastColumn="0" w:noHBand="0" w:noVBand="0" w:val="0020"/>
+      </w:tblPr>
+      <w:tblGrid>
+        <w:gridCol w:w="1980"/>
+        <w:gridCol w:w="1980"/>
+        <w:gridCol w:w="1980"/>
+        <w:gridCol w:w="1980"/>
+      </w:tblGrid>
+      <w:tr>
+        <w:trPr>
+          <w:tblHeader w:val="on"/>
+        </w:trPr>
+        <w:tc>
+          <w:tcPr/>
+          <w:p>
+            <w:pPr>
+              <w:pStyle w:val="Compact"/>
+            </w:pPr>
+            <w:r>
+              <w:t xml:space="preserve">الاستراتيجية</w:t>
+            </w:r>
+          </w:p>
+        </w:tc>
+        <w:tc>
+          <w:tcPr/>
+          <w:p>
+            <w:pPr>
+              <w:pStyle w:val="Compact"/>
+            </w:pPr>
+            <w:r>
+              <w:t xml:space="preserve">الدقة المتوازنة</w:t>
+            </w:r>
+          </w:p>
+        </w:tc>
+        <w:tc>
+          <w:tcPr/>
+          <w:p>
+            <w:pPr>
+              <w:pStyle w:val="Compact"/>
+            </w:pPr>
+            <w:r>
+              <w:t xml:space="preserve">استدعاء السليم</w:t>
+            </w:r>
+          </w:p>
+        </w:tc>
+        <w:tc>
+          <w:tcPr/>
+          <w:p>
+            <w:pPr>
+              <w:pStyle w:val="Compact"/>
+            </w:pPr>
+            <w:r>
+              <w:t xml:space="preserve">استدعاء العطل</w:t>
+            </w:r>
+          </w:p>
+        </w:tc>
+      </w:tr>
+      <w:tr>
+        <w:tc>
+          <w:tcPr/>
+          <w:p>
+            <w:pPr>
+              <w:pStyle w:val="Compact"/>
+            </w:pPr>
+            <w:r>
+              <w:t xml:space="preserve">الأساس (baseline)</w:t>
+            </w:r>
+          </w:p>
+        </w:tc>
+        <w:tc>
+          <w:tcPr/>
+          <w:p>
+            <w:pPr>
+              <w:pStyle w:val="Compact"/>
+            </w:pPr>
+            <w:r>
+              <w:t xml:space="preserve">0.70</w:t>
+            </w:r>
+          </w:p>
+        </w:tc>
+        <w:tc>
+          <w:tcPr/>
+          <w:p>
+            <w:pPr>
+              <w:pStyle w:val="Compact"/>
+            </w:pPr>
+            <w:r>
+              <w:t xml:space="preserve">1.00</w:t>
+            </w:r>
+          </w:p>
+        </w:tc>
+        <w:tc>
+          <w:tcPr/>
+          <w:p>
+            <w:pPr>
+              <w:pStyle w:val="Compact"/>
+            </w:pPr>
+            <w:r>
+              <w:t xml:space="preserve">0.40</w:t>
+            </w:r>
+          </w:p>
+        </w:tc>
+      </w:tr>
+      <w:tr>
+        <w:tc>
+          <w:tcPr/>
+          <w:p>
+            <w:pPr>
+              <w:pStyle w:val="Compact"/>
+            </w:pPr>
+            <w:r>
+              <w:t xml:space="preserve">+ SpecAugment</w:t>
+            </w:r>
+          </w:p>
+        </w:tc>
+        <w:tc>
+          <w:tcPr/>
+          <w:p>
+            <w:pPr>
+              <w:pStyle w:val="Compact"/>
+            </w:pPr>
+            <w:r>
+              <w:t xml:space="preserve">0.71</w:t>
+            </w:r>
+          </w:p>
+        </w:tc>
+        <w:tc>
+          <w:tcPr/>
+          <w:p>
+            <w:pPr>
+              <w:pStyle w:val="Compact"/>
+            </w:pPr>
+            <w:r>
+              <w:t xml:space="preserve">1.00</w:t>
+            </w:r>
+          </w:p>
+        </w:tc>
+        <w:tc>
+          <w:tcPr/>
+          <w:p>
+            <w:pPr>
+              <w:pStyle w:val="Compact"/>
+            </w:pPr>
+            <w:r>
+              <w:t xml:space="preserve">0.42</w:t>
+            </w:r>
+          </w:p>
+        </w:tc>
+      </w:tr>
+      <w:tr>
+        <w:tc>
+          <w:tcPr/>
+          <w:p>
+            <w:pPr>
+              <w:pStyle w:val="Compact"/>
+            </w:pPr>
+            <w:r>
+              <w:t xml:space="preserve">تدريب مسبق اصطناعي ← ضبط دقيق حقيقي</w:t>
+            </w:r>
+          </w:p>
+        </w:tc>
+        <w:tc>
+          <w:tcPr/>
+          <w:p>
+            <w:pPr>
+              <w:pStyle w:val="Compact"/>
+            </w:pPr>
+            <w:r>
+              <w:rPr>
+                <w:b/>
+                <w:bCs/>
+              </w:rPr>
+              <w:t xml:space="preserve">0.35</w:t>
+            </w:r>
+          </w:p>
+        </w:tc>
+        <w:tc>
+          <w:tcPr/>
+          <w:p>
+            <w:pPr>
+              <w:pStyle w:val="Compact"/>
+            </w:pPr>
+            <w:r>
+              <w:t xml:space="preserve">0.00</w:t>
+            </w:r>
+          </w:p>
+        </w:tc>
+        <w:tc>
+          <w:tcPr/>
+          <w:p>
+            <w:pPr>
+              <w:pStyle w:val="Compact"/>
+            </w:pPr>
+            <w:r>
+              <w:t xml:space="preserve">0.71</w:t>
+            </w:r>
+          </w:p>
+        </w:tc>
+      </w:tr>
+    </w:tbl>
+    <w:p>
+      <w:pPr>
+        <w:pStyle w:val="CaptionedFigure"/>
+      </w:pPr>
+      <w:r>
+        <w:drawing>
+          <wp:inline>
+            <wp:extent cx="5334000" cy="3556000"/>
+            <wp:effectExtent b="0" l="0" r="0" t="0"/>
+            <wp:docPr descr="استراتيجيات البيانات المُولّدة" title="" id="68" name="Picture"/>
+            <a:graphic>
+              <a:graphicData uri="http://schemas.openxmlformats.org/drawingml/2006/picture">
+                <pic:pic>
+                  <pic:nvPicPr>
+                    <pic:cNvPr descr="../../results/transfer_experiment.png" id="69" name="Picture"/>
+                    <pic:cNvPicPr>
+                      <a:picLocks noChangeArrowheads="1" noChangeAspect="1"/>
+                    </pic:cNvPicPr>
+                  </pic:nvPicPr>
+                  <pic:blipFill>
+                    <a:blip r:embed="rId67"/>
+                    <a:stretch>
+                      <a:fillRect/>
+                    </a:stretch>
+                  </pic:blipFill>
+                  <pic:spPr bwMode="auto">
+                    <a:xfrm>
+                      <a:off x="0" y="0"/>
+                      <a:ext cx="5334000" cy="3556000"/>
+                    </a:xfrm>
+                    <a:prstGeom prst="rect">
+                      <a:avLst/>
+                    </a:prstGeom>
+                    <a:noFill/>
+                    <a:ln w="9525">
+                      <a:noFill/>
+                      <a:headEnd/>
+                      <a:tailEnd/>
+                    </a:ln>
+                  </pic:spPr>
+                </pic:pic>
+              </a:graphicData>
+            </a:graphic>
+          </wp:inline>
+        </w:drawing>
+      </w:r>
+    </w:p>
+    <w:p>
+      <w:pPr>
+        <w:pStyle w:val="ImageCaption"/>
+      </w:pPr>
+      <w:r>
+        <w:t xml:space="preserve">استراتيجيات البيانات المُولّدة</w:t>
+      </w:r>
+    </w:p>
+    <w:p>
+      <w:pPr>
+        <w:pStyle w:val="BodyText"/>
+      </w:pPr>
+      <w:r>
+        <w:rPr>
+          <w:i/>
+          <w:iCs/>
+        </w:rPr>
+        <w:t xml:space="preserve">الشكل 9.4 — استراتيجيات البيانات المُولّدة على قناة التيّار الحقيقية.</w:t>
+      </w:r>
+      <w:r>
+        <w:t xml:space="preserve"> </w:t>
+      </w:r>
+      <w:r>
+        <w:t xml:space="preserve">النتيجة سلبية</w:t>
+      </w:r>
+      <w:r>
+        <w:t xml:space="preserve"> </w:t>
+      </w:r>
+      <w:r>
+        <w:t xml:space="preserve">وأمينة: التعزيز منح تحسناً مهملاً، و</w:t>
+      </w:r>
+      <w:r>
+        <w:rPr>
+          <w:b/>
+          <w:bCs/>
+        </w:rPr>
+        <w:t xml:space="preserve">التدريب المسبق على بياناتنا الاصطناعية الغنية أضرّ</w:t>
+      </w:r>
+      <w:r>
+        <w:t xml:space="preserve"> </w:t>
+      </w:r>
+      <w:r>
+        <w:t xml:space="preserve">(0.70 ← 0.35) — وهي</w:t>
+      </w:r>
+      <w:r>
+        <w:t xml:space="preserve"> </w:t>
+      </w:r>
+      <w:r>
+        <w:rPr>
+          <w:b/>
+          <w:bCs/>
+        </w:rPr>
+        <w:t xml:space="preserve">فجوة مجال (domain gap)</w:t>
+      </w:r>
+      <w:r>
+        <w:t xml:space="preserve">، لأنّ الإشارة</w:t>
+      </w:r>
+      <w:r>
+        <w:t xml:space="preserve"> </w:t>
+      </w:r>
+      <w:r>
+        <w:t xml:space="preserve">“السليمة”</w:t>
+      </w:r>
+      <w:r>
+        <w:t xml:space="preserve"> </w:t>
+      </w:r>
+      <w:r>
+        <w:t xml:space="preserve">الاصطناعية نموذج</w:t>
+      </w:r>
+      <w:r>
+        <w:t xml:space="preserve"> </w:t>
+      </w:r>
+      <w:r>
+        <w:t xml:space="preserve">مُبسّط لا تستطيع المجموعة الحقيقية الصغيرة تصحيح إحصاءاته. ويتناقض هذا مع النقل من ImageNet</w:t>
+      </w:r>
+      <w:r>
+        <w:t xml:space="preserve"> </w:t>
+      </w:r>
+      <w:r>
+        <w:t xml:space="preserve">(§9.5، 0.89): فالخصائص</w:t>
+      </w:r>
+      <w:r>
+        <w:t xml:space="preserve"> </w:t>
+      </w:r>
+      <w:r>
+        <w:rPr>
+          <w:i/>
+          <w:iCs/>
+        </w:rPr>
+        <w:t xml:space="preserve">الواقعية العامة</w:t>
+      </w:r>
+      <w:r>
+        <w:t xml:space="preserve"> </w:t>
+      </w:r>
+      <w:r>
+        <w:t xml:space="preserve">تنتقل، أما المحاكي اليدوي الضيّق فلا. الخلاصة:</w:t>
+      </w:r>
+      <w:r>
+        <w:t xml:space="preserve"> </w:t>
+      </w:r>
+      <w:r>
+        <w:t xml:space="preserve">البيانات الاصطناعية قيّمة للتحقق البرمجي ولفئتَي إزالة المغنطة/الحِمل الزائد،</w:t>
+      </w:r>
+      <w:r>
+        <w:t xml:space="preserve"> </w:t>
+      </w:r>
+      <w:r>
+        <w:rPr>
+          <w:b/>
+          <w:bCs/>
+        </w:rPr>
+        <w:t xml:space="preserve">لكنها لا</w:t>
+      </w:r>
+      <w:r>
+        <w:rPr>
+          <w:b/>
+          <w:bCs/>
+        </w:rPr>
+        <w:t xml:space="preserve"> </w:t>
+      </w:r>
+      <w:r>
+        <w:rPr>
+          <w:b/>
+          <w:bCs/>
+        </w:rPr>
+        <w:t xml:space="preserve">تُغني عن تنوّع التسجيلات الحقيقية</w:t>
+      </w:r>
+      <w:r>
+        <w:t xml:space="preserve"> </w:t>
+      </w:r>
+      <w:r>
+        <w:t xml:space="preserve">— وهو الرافعة الحقيقية (انظر §8.4).</w:t>
+      </w:r>
+    </w:p>
+    <w:bookmarkEnd w:id="70"/>
+    <w:bookmarkStart w:id="71" w:name="ضوابط-فرط-التخصيص"/>
+    <w:p>
+      <w:pPr>
+        <w:pStyle w:val="Heading3"/>
+      </w:pPr>
+      <w:r>
+        <w:t xml:space="preserve">9.7 ضوابط فرط التخصيص</w:t>
       </w:r>
     </w:p>
     <w:p>
@@ -6207,9 +6632,9 @@
         </w:pict>
       </w:r>
     </w:p>
-    <w:bookmarkEnd w:id="67"/>
-    <w:bookmarkEnd w:id="68"/>
-    <w:bookmarkStart w:id="72" w:name="الاستنتاجات-والعمل-المستقبلي"/>
+    <w:bookmarkEnd w:id="71"/>
+    <w:bookmarkEnd w:id="72"/>
+    <w:bookmarkStart w:id="76" w:name="الاستنتاجات-والعمل-المستقبلي"/>
     <w:p>
       <w:pPr>
         <w:pStyle w:val="Heading2"/>
@@ -6218,7 +6643,7 @@
         <w:t xml:space="preserve">10. الاستنتاجات والعمل المستقبلي</w:t>
       </w:r>
     </w:p>
-    <w:bookmarkStart w:id="69" w:name="الاستنتاجات"/>
+    <w:bookmarkStart w:id="73" w:name="الاستنتاجات"/>
     <w:p>
       <w:pPr>
         <w:pStyle w:val="Heading3"/>
@@ -6320,8 +6745,8 @@
         <w:t xml:space="preserve">العمل مدعوم بـ 38 اختبار وحدة وتكامل مستمر، ومتاح علناً ليتمكّن باحثون آخرون من إعادة إنتاجه وتوسيعه.</w:t>
       </w:r>
     </w:p>
-    <w:bookmarkEnd w:id="69"/>
-    <w:bookmarkStart w:id="70" w:name="القيود"/>
+    <w:bookmarkEnd w:id="73"/>
+    <w:bookmarkStart w:id="74" w:name="القيود"/>
     <w:p>
       <w:pPr>
         <w:pStyle w:val="Heading3"/>
@@ -6338,8 +6763,8 @@
         <w:t xml:space="preserve">القيد الرئيسي هو العدد الصغير من التسجيلات السليمة المستقلة، الذي يقيّد مدى قوة ادعاء التعميم. وإزالة المغنطة والحِمل الزائد حاضران اصطناعياً فقط. ومقارنة الاندماج إرشادية لا مضبوطة بدقة.</w:t>
       </w:r>
     </w:p>
-    <w:bookmarkEnd w:id="70"/>
-    <w:bookmarkStart w:id="71" w:name="العمل-المستقبلي"/>
+    <w:bookmarkEnd w:id="74"/>
+    <w:bookmarkStart w:id="75" w:name="العمل-المستقبلي"/>
     <w:p>
       <w:pPr>
         <w:pStyle w:val="Heading3"/>
@@ -6465,9 +6890,9 @@
         </w:pict>
       </w:r>
     </w:p>
-    <w:bookmarkEnd w:id="71"/>
-    <w:bookmarkEnd w:id="72"/>
-    <w:bookmarkStart w:id="73" w:name="المراجع"/>
+    <w:bookmarkEnd w:id="75"/>
+    <w:bookmarkEnd w:id="76"/>
+    <w:bookmarkStart w:id="77" w:name="المراجع"/>
     <w:p>
       <w:pPr>
         <w:pStyle w:val="Heading2"/>
@@ -6846,8 +7271,8 @@
         </w:pict>
       </w:r>
     </w:p>
-    <w:bookmarkEnd w:id="73"/>
-    <w:bookmarkStart w:id="74" w:name="الملحق-a-إعادة-إنتاج-النتائج"/>
+    <w:bookmarkEnd w:id="77"/>
+    <w:bookmarkStart w:id="78" w:name="الملحق-a-إعادة-إنتاج-النتائج"/>
     <w:p>
       <w:pPr>
         <w:pStyle w:val="Heading2"/>
@@ -7158,8 +7583,8 @@
         <w:t xml:space="preserve"> demo</w:t>
       </w:r>
     </w:p>
-    <w:bookmarkEnd w:id="74"/>
-    <w:bookmarkStart w:id="75" w:name="الملحق-b-الضبط-الأساسي-config.yaml"/>
+    <w:bookmarkEnd w:id="78"/>
+    <w:bookmarkStart w:id="79" w:name="الملحق-b-الضبط-الأساسي-config.yaml"/>
     <w:p>
       <w:pPr>
         <w:pStyle w:val="Heading2"/>
@@ -7646,8 +8071,8 @@
         </w:tc>
       </w:tr>
     </w:tbl>
-    <w:bookmarkEnd w:id="75"/>
-    <w:bookmarkStart w:id="76" w:name="الملحق-c-تخطيط-المستودع"/>
+    <w:bookmarkEnd w:id="79"/>
+    <w:bookmarkStart w:id="80" w:name="الملحق-c-تخطيط-المستودع"/>
     <w:p>
       <w:pPr>
         <w:pStyle w:val="Heading2"/>
@@ -7739,8 +8164,8 @@
         <w:t xml:space="preserve">config.yaml    all parameters · Makefile  targets · CITATION.cff</w:t>
       </w:r>
     </w:p>
-    <w:bookmarkEnd w:id="76"/>
-    <w:bookmarkStart w:id="77" w:name="الملحق-d-مخطط-المانيفست-datamanifest.csv"/>
+    <w:bookmarkEnd w:id="80"/>
+    <w:bookmarkStart w:id="81" w:name="الملحق-d-مخطط-المانيفست-datamanifest.csv"/>
     <w:p>
       <w:pPr>
         <w:pStyle w:val="Heading2"/>
@@ -7775,8 +8200,8 @@
         <w:t xml:space="preserve">— صفّ واحد لكل مقطع؛ وهو المصدر الوحيد للحقيقة الذي يربط كل نافذة إشارة بمخططها الطيفي وتسميتها وتقسيمها.</w:t>
       </w:r>
     </w:p>
-    <w:bookmarkEnd w:id="77"/>
-    <w:bookmarkStart w:id="78" w:name="الملحق-e-جرد-الاختبارات-38-اختبارا"/>
+    <w:bookmarkEnd w:id="81"/>
+    <w:bookmarkStart w:id="82" w:name="الملحق-e-جرد-الاختبارات-38-اختبارا"/>
     <w:p>
       <w:pPr>
         <w:pStyle w:val="Heading2"/>
@@ -7793,8 +8218,8 @@
         <w:t xml:space="preserve">التحقق من الضبط؛ عمليات CRUD على المانيفست؛ التقسيم الخالي من التسرّب (بما في ذلك ضمانات الفئات الصغيرة)؛ التقطيع؛ تحليل أسماء ملفات KAIST؛ موازنة الفئات؛ ترجيح الفئات؛ شكل المخطط الطيفي؛ المولّد الاصطناعي؛ فهرسة محمّل البيانات؛ بناء النموذج المرجعي ونموذج الاندماج؛ إقران الاندماج (لا حالة تمتدّ عبر التقسيمات)؛ اختبار دخان (smoke test) للتدريب؛ مقاييس التقييم (بما في ذلك مجموعة جزئية من الفئات). وتتخطّى الاختبارات المعتمدة على TensorFlow تخطّياً نظيفاً عند غياب TF.</w:t>
       </w:r>
     </w:p>
-    <w:bookmarkEnd w:id="78"/>
-    <w:bookmarkStart w:id="79" w:name="الملحق-f-تدقيق-مجموعات-البيانات"/>
+    <w:bookmarkEnd w:id="82"/>
+    <w:bookmarkStart w:id="83" w:name="الملحق-f-تدقيق-مجموعات-البيانات"/>
     <w:p>
       <w:pPr>
         <w:pStyle w:val="Heading2"/>
@@ -8140,8 +8565,8 @@
         <w:t xml:space="preserve">ملاحظة حول الطول/الصيغة: حُرِّر هذا التقرير بصيغة Markdown؛ وعند تنضيده إلى A4/Letter (Word أو LaTeX) مع الأشكال والجداول وتباعد أسطر 1.15–1.5 يمتدّ على 25–35 صفحة المطلوبة.</w:t>
       </w:r>
     </w:p>
-    <w:bookmarkEnd w:id="79"/>
-    <w:bookmarkEnd w:id="80"/>
+    <w:bookmarkEnd w:id="83"/>
+    <w:bookmarkEnd w:id="84"/>
     <w:sectPr>
       <w:footnotePr>
         <w:numRestart w:val="eachSect"/>

</xml_diff>